<commit_message>
Report with demo evidence commit
</commit_message>
<xml_diff>
--- a/IR_Assignment2_Report.docx
+++ b/IR_Assignment2_Report.docx
@@ -1,6 +1,6 @@
 
 <file path=word/document.xml><?xml version="1.0" encoding="utf-8"?>
-<w:document xmlns:wpc="http://schemas.microsoft.com/office/word/2010/wordprocessingCanvas" xmlns:cx="http://schemas.microsoft.com/office/drawing/2014/chartex" xmlns:cx1="http://schemas.microsoft.com/office/drawing/2015/9/8/chartex" xmlns:cx2="http://schemas.microsoft.com/office/drawing/2015/10/21/chartex" xmlns:cx3="http://schemas.microsoft.com/office/drawing/2016/5/9/chartex" xmlns:cx4="http://schemas.microsoft.com/office/drawing/2016/5/10/chartex" xmlns:cx5="http://schemas.microsoft.com/office/drawing/2016/5/11/chartex" xmlns:cx6="http://schemas.microsoft.com/office/drawing/2016/5/12/chartex" xmlns:cx7="http://schemas.microsoft.com/office/drawing/2016/5/13/chartex" xmlns:cx8="http://schemas.microsoft.com/office/drawing/2016/5/14/chartex" xmlns:mc="http://schemas.openxmlformats.org/markup-compatibility/2006" xmlns:aink="http://schemas.microsoft.com/office/drawing/2016/ink" xmlns:am3d="http://schemas.microsoft.com/office/drawing/2017/model3d" xmlns:o="urn:schemas-microsoft-com:office:office" xmlns:oel="http://schemas.microsoft.com/office/2019/extlst" xmlns:r="http://schemas.openxmlformats.org/officeDocument/2006/relationships" xmlns:m="http://schemas.openxmlformats.org/officeDocument/2006/math" xmlns:v="urn:schemas-microsoft-com:vml" xmlns:wp14="http://schemas.microsoft.com/office/word/2010/wordprocessingDrawing" xmlns:wp="http://schemas.openxmlformats.org/drawingml/2006/wordprocessingDrawing" xmlns:w10="urn:schemas-microsoft-com:office:word" xmlns:w="http://schemas.openxmlformats.org/wordprocessingml/2006/main" xmlns:w14="http://schemas.microsoft.com/office/word/2010/wordml" xmlns:w15="http://schemas.microsoft.com/office/word/2012/wordml" xmlns:w16cei="http://schemas.microsoft.com/office/word/2026/wordml/cei" xmlns:w16cex="http://schemas.microsoft.com/office/word/2018/wordml/cex" xmlns:w16cid="http://schemas.microsoft.com/office/word/2016/wordml/cid" xmlns:w16="http://schemas.microsoft.com/office/word/2018/wordml" xmlns:w16du="http://schemas.microsoft.com/office/word/2023/wordml/word16du" xmlns:w16sdtdh="http://schemas.microsoft.com/office/word/2020/wordml/sdtdatahash" xmlns:w16sdtfl="http://schemas.microsoft.com/office/word/2024/wordml/sdtformatlock" xmlns:w16se="http://schemas.microsoft.com/office/word/2015/wordml/symex" xmlns:wpg="http://schemas.microsoft.com/office/word/2010/wordprocessingGroup" xmlns:wpi="http://schemas.microsoft.com/office/word/2010/wordprocessingInk" xmlns:wne="http://schemas.microsoft.com/office/word/2006/wordml" xmlns:wps="http://schemas.microsoft.com/office/word/2010/wordprocessingShape" mc:Ignorable="w14 w15 w16se w16cid w16 w16cex w16sdtdh w16sdtfl w16du wp14">
+<w:document xmlns:wpc="http://schemas.microsoft.com/office/word/2010/wordprocessingCanvas" xmlns:cx="http://schemas.microsoft.com/office/drawing/2014/chartex" xmlns:cx1="http://schemas.microsoft.com/office/drawing/2015/9/8/chartex" xmlns:cx2="http://schemas.microsoft.com/office/drawing/2015/10/21/chartex" xmlns:cx3="http://schemas.microsoft.com/office/drawing/2016/5/9/chartex" xmlns:cx4="http://schemas.microsoft.com/office/drawing/2016/5/10/chartex" xmlns:cx5="http://schemas.microsoft.com/office/drawing/2016/5/11/chartex" xmlns:cx6="http://schemas.microsoft.com/office/drawing/2016/5/12/chartex" xmlns:cx7="http://schemas.microsoft.com/office/drawing/2016/5/13/chartex" xmlns:cx8="http://schemas.microsoft.com/office/drawing/2016/5/14/chartex" xmlns:mc="http://schemas.openxmlformats.org/markup-compatibility/2006" xmlns:aink="http://schemas.microsoft.com/office/drawing/2016/ink" xmlns:am3d="http://schemas.microsoft.com/office/drawing/2017/model3d" xmlns:o="urn:schemas-microsoft-com:office:office" xmlns:oel="http://schemas.microsoft.com/office/2019/extlst" xmlns:r="http://schemas.openxmlformats.org/officeDocument/2006/relationships" xmlns:m="http://schemas.openxmlformats.org/officeDocument/2006/math" xmlns:v="urn:schemas-microsoft-com:vml" xmlns:wp14="http://schemas.microsoft.com/office/word/2010/wordprocessingDrawing" xmlns:wp="http://schemas.openxmlformats.org/drawingml/2006/wordprocessingDrawing" xmlns:w10="urn:schemas-microsoft-com:office:word" xmlns:w="http://schemas.openxmlformats.org/wordprocessingml/2006/main" xmlns:w14="http://schemas.microsoft.com/office/word/2010/wordml" xmlns:w15="http://schemas.microsoft.com/office/word/2012/wordml" xmlns:w16cex="http://schemas.microsoft.com/office/word/2018/wordml/cex" xmlns:w16cid="http://schemas.microsoft.com/office/word/2016/wordml/cid" xmlns:w16="http://schemas.microsoft.com/office/word/2018/wordml" xmlns:w16du="http://schemas.microsoft.com/office/word/2023/wordml/word16du" xmlns:w16sdtdh="http://schemas.microsoft.com/office/word/2020/wordml/sdtdatahash" xmlns:w16sdtfl="http://schemas.microsoft.com/office/word/2024/wordml/sdtformatlock" xmlns:w16se="http://schemas.microsoft.com/office/word/2015/wordml/symex" xmlns:wpg="http://schemas.microsoft.com/office/word/2010/wordprocessingGroup" xmlns:wpi="http://schemas.microsoft.com/office/word/2010/wordprocessingInk" xmlns:wne="http://schemas.microsoft.com/office/word/2006/wordml" xmlns:wps="http://schemas.microsoft.com/office/word/2010/wordprocessingShape" mc:Ignorable="w14 w15 w16se w16cid w16 w16cex w16sdtdh w16sdtfl w16du wp14">
   <w:body>
     <w:p>
       <w:pPr>
@@ -502,27 +502,14 @@
           <w:sz w:val="22"/>
         </w:rPr>
       </w:pPr>
-      <w:proofErr w:type="spellStart"/>
       <w:r>
         <w:rPr>
           <w:sz w:val="22"/>
         </w:rPr>
-        <w:t>Streamlit</w:t>
-      </w:r>
-      <w:proofErr w:type="spellEnd"/>
-      <w:r>
-        <w:rPr>
-          <w:sz w:val="22"/>
-        </w:rPr>
-        <w:t xml:space="preserve"> App Url: </w:t>
+        <w:t xml:space="preserve">Streamlit App Url: </w:t>
       </w:r>
     </w:p>
     <w:p>
-      <w:pPr>
-        <w:rPr>
-          <w:sz w:val="22"/>
-        </w:rPr>
-      </w:pPr>
       <w:hyperlink r:id="rId6" w:history="1">
         <w:r>
           <w:rPr>
@@ -533,53 +520,10 @@
         </w:r>
       </w:hyperlink>
     </w:p>
-    <w:p>
-      <w:pPr>
-        <w:jc w:val="center"/>
-      </w:pPr>
-    </w:p>
-    <w:p>
-      <w:pPr>
-        <w:pBdr>
-          <w:top w:val="single" w:sz="12" w:space="4" w:color="C00000"/>
-          <w:left w:val="single" w:sz="12" w:space="4" w:color="C00000"/>
-          <w:bottom w:val="single" w:sz="12" w:space="4" w:color="C00000"/>
-          <w:right w:val="single" w:sz="12" w:space="4" w:color="C00000"/>
-        </w:pBdr>
-        <w:spacing w:before="120" w:after="200"/>
-      </w:pPr>
-      <w:proofErr w:type="gramStart"/>
-      <w:r>
-        <w:rPr>
-          <w:b/>
-          <w:color w:val="C00000"/>
-          <w:sz w:val="20"/>
-        </w:rPr>
-        <w:t>[ Add</w:t>
-      </w:r>
-      <w:proofErr w:type="gramEnd"/>
-      <w:r>
-        <w:rPr>
-          <w:b/>
-          <w:color w:val="C00000"/>
-          <w:sz w:val="20"/>
-        </w:rPr>
-        <w:t xml:space="preserve"> a screenshot here — a screenshot of the app running in your BITS Virtual Lab </w:t>
-      </w:r>
-      <w:proofErr w:type="gramStart"/>
-      <w:r>
-        <w:rPr>
-          <w:b/>
-          <w:color w:val="C00000"/>
-          <w:sz w:val="20"/>
-        </w:rPr>
-        <w:t>session ]</w:t>
-      </w:r>
-      <w:proofErr w:type="gramEnd"/>
-    </w:p>
+    <w:p/>
     <w:p>
       <w:r>
-        <w:br w:type="page"/>
+        <w:t>Localhost running in Virtual Lab</w:t>
       </w:r>
     </w:p>
     <w:p>
@@ -587,25 +531,145 @@
         <w:pStyle w:val="Heading1"/>
       </w:pPr>
       <w:r>
+        <w:drawing>
+          <wp:inline distT="0" distB="0" distL="0" distR="0" wp14:anchorId="783B07A0" wp14:editId="719F6412">
+            <wp:extent cx="5486400" cy="3071495"/>
+            <wp:effectExtent l="0" t="0" r="0" b="0"/>
+            <wp:docPr id="1605117248" name="Picture 1"/>
+            <wp:cNvGraphicFramePr>
+              <a:graphicFrameLocks xmlns:a="http://schemas.openxmlformats.org/drawingml/2006/main" noChangeAspect="1"/>
+            </wp:cNvGraphicFramePr>
+            <a:graphic xmlns:a="http://schemas.openxmlformats.org/drawingml/2006/main">
+              <a:graphicData uri="http://schemas.openxmlformats.org/drawingml/2006/picture">
+                <pic:pic xmlns:pic="http://schemas.openxmlformats.org/drawingml/2006/picture">
+                  <pic:nvPicPr>
+                    <pic:cNvPr id="1605117248" name=""/>
+                    <pic:cNvPicPr/>
+                  </pic:nvPicPr>
+                  <pic:blipFill>
+                    <a:blip r:embed="rId7"/>
+                    <a:stretch>
+                      <a:fillRect/>
+                    </a:stretch>
+                  </pic:blipFill>
+                  <pic:spPr>
+                    <a:xfrm>
+                      <a:off x="0" y="0"/>
+                      <a:ext cx="5486400" cy="3071495"/>
+                    </a:xfrm>
+                    <a:prstGeom prst="rect">
+                      <a:avLst/>
+                    </a:prstGeom>
+                  </pic:spPr>
+                </pic:pic>
+              </a:graphicData>
+            </a:graphic>
+          </wp:inline>
+        </w:drawing>
+      </w:r>
+    </w:p>
+    <w:p/>
+    <w:p>
+      <w:r>
         <w:lastRenderedPageBreak/>
+        <w:drawing>
+          <wp:inline distT="0" distB="0" distL="0" distR="0" wp14:anchorId="3C43D346" wp14:editId="4E4F76A5">
+            <wp:extent cx="5486400" cy="3084195"/>
+            <wp:effectExtent l="0" t="0" r="0" b="1905"/>
+            <wp:docPr id="1299635489" name="Picture 1"/>
+            <wp:cNvGraphicFramePr>
+              <a:graphicFrameLocks xmlns:a="http://schemas.openxmlformats.org/drawingml/2006/main" noChangeAspect="1"/>
+            </wp:cNvGraphicFramePr>
+            <a:graphic xmlns:a="http://schemas.openxmlformats.org/drawingml/2006/main">
+              <a:graphicData uri="http://schemas.openxmlformats.org/drawingml/2006/picture">
+                <pic:pic xmlns:pic="http://schemas.openxmlformats.org/drawingml/2006/picture">
+                  <pic:nvPicPr>
+                    <pic:cNvPr id="1299635489" name=""/>
+                    <pic:cNvPicPr/>
+                  </pic:nvPicPr>
+                  <pic:blipFill>
+                    <a:blip r:embed="rId8"/>
+                    <a:stretch>
+                      <a:fillRect/>
+                    </a:stretch>
+                  </pic:blipFill>
+                  <pic:spPr>
+                    <a:xfrm>
+                      <a:off x="0" y="0"/>
+                      <a:ext cx="5486400" cy="3084195"/>
+                    </a:xfrm>
+                    <a:prstGeom prst="rect">
+                      <a:avLst/>
+                    </a:prstGeom>
+                  </pic:spPr>
+                </pic:pic>
+              </a:graphicData>
+            </a:graphic>
+          </wp:inline>
+        </w:drawing>
+      </w:r>
+    </w:p>
+    <w:p/>
+    <w:p>
+      <w:r>
+        <w:t>Live Url running in Virtual Lab</w:t>
+      </w:r>
+    </w:p>
+    <w:p>
+      <w:r>
+        <w:drawing>
+          <wp:inline distT="0" distB="0" distL="0" distR="0" wp14:anchorId="748FE7D3" wp14:editId="6185E4AD">
+            <wp:extent cx="5486400" cy="3077210"/>
+            <wp:effectExtent l="0" t="0" r="0" b="8890"/>
+            <wp:docPr id="1767312432" name="Picture 1"/>
+            <wp:cNvGraphicFramePr>
+              <a:graphicFrameLocks xmlns:a="http://schemas.openxmlformats.org/drawingml/2006/main" noChangeAspect="1"/>
+            </wp:cNvGraphicFramePr>
+            <a:graphic xmlns:a="http://schemas.openxmlformats.org/drawingml/2006/main">
+              <a:graphicData uri="http://schemas.openxmlformats.org/drawingml/2006/picture">
+                <pic:pic xmlns:pic="http://schemas.openxmlformats.org/drawingml/2006/picture">
+                  <pic:nvPicPr>
+                    <pic:cNvPr id="1767312432" name=""/>
+                    <pic:cNvPicPr/>
+                  </pic:nvPicPr>
+                  <pic:blipFill>
+                    <a:blip r:embed="rId9"/>
+                    <a:stretch>
+                      <a:fillRect/>
+                    </a:stretch>
+                  </pic:blipFill>
+                  <pic:spPr>
+                    <a:xfrm>
+                      <a:off x="0" y="0"/>
+                      <a:ext cx="5486400" cy="3077210"/>
+                    </a:xfrm>
+                    <a:prstGeom prst="rect">
+                      <a:avLst/>
+                    </a:prstGeom>
+                  </pic:spPr>
+                </pic:pic>
+              </a:graphicData>
+            </a:graphic>
+          </wp:inline>
+        </w:drawing>
+      </w:r>
+    </w:p>
+    <w:p>
+      <w:pPr>
+        <w:pStyle w:val="Heading1"/>
+      </w:pPr>
+      <w:r>
         <w:t>What this project is</w:t>
       </w:r>
     </w:p>
     <w:p>
       <w:r>
-        <w:t xml:space="preserve">This project is a small, complete information retrieval system, built end to end and wrapped in a </w:t>
-      </w:r>
-      <w:proofErr w:type="spellStart"/>
-      <w:r>
-        <w:t>Streamlit</w:t>
-      </w:r>
-      <w:proofErr w:type="spellEnd"/>
-      <w:r>
-        <w:t xml:space="preserve"> app so every step — collecting documents, cleaning and understanding them, indexing, searching, ranking, recommending, and evaluating </w:t>
+        <w:t xml:space="preserve">This project is a small, complete information retrieval system, built end to end and wrapped in a Streamlit app so every step — collecting documents, cleaning and understanding them, indexing, searching, ranking, recommending, and evaluating </w:t>
       </w:r>
     </w:p>
     <w:p>
       <w:r>
+        <w:lastRenderedPageBreak/>
         <w:t xml:space="preserve">The dataset is a corpus of about 60 Wikipedia articles, crawled starting from seven AI/ML/robotics-related topics, with the option to mix in an extra CSV of unrelated tech articles to show the system can absorb documents from more than one source. </w:t>
       </w:r>
     </w:p>
@@ -637,69 +701,92 @@
     </w:p>
     <w:p>
       <w:r>
-        <w:t xml:space="preserve">Everything the crawler learns about a page — its title, URL, which seed it came from, how deep it was found, whether it turned out to be a duplicate — is kept in a metadata table (data/metadata/metadata.csv), </w:t>
-      </w:r>
-      <w:proofErr w:type="gramStart"/>
-      <w:r>
-        <w:t>completely separate</w:t>
-      </w:r>
-      <w:proofErr w:type="gramEnd"/>
-      <w:r>
-        <w:t xml:space="preserve"> from the article text itself (data/raw/*.txt). That separation is what lets later stages filter and group documents by topic or depth without having to re-read and re-parse the raw text every time.</w:t>
+        <w:t>Everything the crawler learns about a page — its title, URL, which seed it came from, how deep it was found, whether it turned out to be a duplicate — is kept in a metadata table (data/metadata/metadata.csv), completely separate from the article text itself (data/raw/*.txt). That separation is what lets later stages filter and group documents by topic or depth without having to re-read and re-parse the raw text every time.</w:t>
       </w:r>
     </w:p>
     <w:p>
       <w:r>
-        <w:t xml:space="preserve">On the run this report is based on, the crawler processed 62 pages, stored 61 after dropping one exact duplicate, and an extra 12 articles were added from an uploaded CSV covering unrelated tech topics (cloud, blockchain, IoT, and so </w:t>
-      </w:r>
-      <w:proofErr w:type="gramStart"/>
-      <w:r>
-        <w:t>on) —</w:t>
-      </w:r>
-      <w:proofErr w:type="gramEnd"/>
-      <w:r>
-        <w:t xml:space="preserve"> giving 73 documents in the corpus overall.</w:t>
+        <w:t>On the run this report is based on, the crawler processed 62 pages, stored 61 after dropping one exact duplicate, and an extra 12 articles were added from an uploaded CSV covering unrelated tech topics (cloud, blockchain, IoT, and so on) — giving 73 documents in the corpus overall.</w:t>
       </w:r>
     </w:p>
     <w:p>
-      <w:pPr>
-        <w:pBdr>
-          <w:top w:val="single" w:sz="12" w:space="4" w:color="C00000"/>
-          <w:left w:val="single" w:sz="12" w:space="4" w:color="C00000"/>
-          <w:bottom w:val="single" w:sz="12" w:space="4" w:color="C00000"/>
-          <w:right w:val="single" w:sz="12" w:space="4" w:color="C00000"/>
-        </w:pBdr>
-        <w:spacing w:before="120" w:after="200"/>
-      </w:pPr>
-      <w:proofErr w:type="gramStart"/>
       <w:r>
-        <w:rPr>
-          <w:b/>
-          <w:color w:val="C00000"/>
-          <w:sz w:val="20"/>
-        </w:rPr>
         <w:lastRenderedPageBreak/>
-        <w:t>[ Add</w:t>
+        <w:drawing>
+          <wp:inline distT="0" distB="0" distL="0" distR="0" wp14:anchorId="564CAA7C" wp14:editId="4C22FC2E">
+            <wp:extent cx="5486400" cy="3088005"/>
+            <wp:effectExtent l="0" t="0" r="0" b="0"/>
+            <wp:docPr id="2050903464" name="Picture 1"/>
+            <wp:cNvGraphicFramePr>
+              <a:graphicFrameLocks xmlns:a="http://schemas.openxmlformats.org/drawingml/2006/main" noChangeAspect="1"/>
+            </wp:cNvGraphicFramePr>
+            <a:graphic xmlns:a="http://schemas.openxmlformats.org/drawingml/2006/main">
+              <a:graphicData uri="http://schemas.openxmlformats.org/drawingml/2006/picture">
+                <pic:pic xmlns:pic="http://schemas.openxmlformats.org/drawingml/2006/picture">
+                  <pic:nvPicPr>
+                    <pic:cNvPr id="2050903464" name=""/>
+                    <pic:cNvPicPr/>
+                  </pic:nvPicPr>
+                  <pic:blipFill>
+                    <a:blip r:embed="rId10"/>
+                    <a:stretch>
+                      <a:fillRect/>
+                    </a:stretch>
+                  </pic:blipFill>
+                  <pic:spPr>
+                    <a:xfrm>
+                      <a:off x="0" y="0"/>
+                      <a:ext cx="5486400" cy="3088005"/>
+                    </a:xfrm>
+                    <a:prstGeom prst="rect">
+                      <a:avLst/>
+                    </a:prstGeom>
+                  </pic:spPr>
+                </pic:pic>
+              </a:graphicData>
+            </a:graphic>
+          </wp:inline>
+        </w:drawing>
       </w:r>
-      <w:proofErr w:type="gramEnd"/>
+    </w:p>
+    <w:p>
       <w:r>
-        <w:rPr>
-          <w:b/>
-          <w:color w:val="C00000"/>
-          <w:sz w:val="20"/>
-        </w:rPr>
-        <w:t xml:space="preserve"> a screenshot here — the Crawler page — the crawl form, live progress log, and completion </w:t>
+        <w:drawing>
+          <wp:inline distT="0" distB="0" distL="0" distR="0" wp14:anchorId="6F98BAC3" wp14:editId="642F9442">
+            <wp:extent cx="5486400" cy="3084195"/>
+            <wp:effectExtent l="0" t="0" r="0" b="1905"/>
+            <wp:docPr id="293731798" name="Picture 1"/>
+            <wp:cNvGraphicFramePr>
+              <a:graphicFrameLocks xmlns:a="http://schemas.openxmlformats.org/drawingml/2006/main" noChangeAspect="1"/>
+            </wp:cNvGraphicFramePr>
+            <a:graphic xmlns:a="http://schemas.openxmlformats.org/drawingml/2006/main">
+              <a:graphicData uri="http://schemas.openxmlformats.org/drawingml/2006/picture">
+                <pic:pic xmlns:pic="http://schemas.openxmlformats.org/drawingml/2006/picture">
+                  <pic:nvPicPr>
+                    <pic:cNvPr id="293731798" name=""/>
+                    <pic:cNvPicPr/>
+                  </pic:nvPicPr>
+                  <pic:blipFill>
+                    <a:blip r:embed="rId11"/>
+                    <a:stretch>
+                      <a:fillRect/>
+                    </a:stretch>
+                  </pic:blipFill>
+                  <pic:spPr>
+                    <a:xfrm>
+                      <a:off x="0" y="0"/>
+                      <a:ext cx="5486400" cy="3084195"/>
+                    </a:xfrm>
+                    <a:prstGeom prst="rect">
+                      <a:avLst/>
+                    </a:prstGeom>
+                  </pic:spPr>
+                </pic:pic>
+              </a:graphicData>
+            </a:graphic>
+          </wp:inline>
+        </w:drawing>
       </w:r>
-      <w:proofErr w:type="gramStart"/>
-      <w:r>
-        <w:rPr>
-          <w:b/>
-          <w:color w:val="C00000"/>
-          <w:sz w:val="20"/>
-        </w:rPr>
-        <w:t>summary ]</w:t>
-      </w:r>
-      <w:proofErr w:type="gramEnd"/>
     </w:p>
     <w:p>
       <w:pPr>
@@ -711,52 +798,13 @@
     </w:p>
     <w:p>
       <w:r>
-        <w:t xml:space="preserve">Raw Wikipedia text is noisy for modelling purposes, so before anything is indexed it goes through a cleaning pass: lowercase, keep only alphabetic tokens of two or more letters, drop common English </w:t>
-      </w:r>
-      <w:proofErr w:type="spellStart"/>
-      <w:r>
-        <w:t>stopwords</w:t>
-      </w:r>
-      <w:proofErr w:type="spellEnd"/>
-      <w:r>
-        <w:t>, and then normalize what's left — either by lemmatizing (</w:t>
-      </w:r>
-      <w:proofErr w:type="spellStart"/>
-      <w:r>
-        <w:t>WordNetLemmatizer</w:t>
-      </w:r>
-      <w:proofErr w:type="spellEnd"/>
-      <w:r>
-        <w:t>), stemming (</w:t>
-      </w:r>
-      <w:proofErr w:type="spellStart"/>
-      <w:r>
-        <w:t>PorterStemmer</w:t>
-      </w:r>
-      <w:proofErr w:type="spellEnd"/>
-      <w:r>
-        <w:t>), or leaving it as-is, depending on which configuration is being tested. From the cleaned text, both a bag-of-words representation and a TF-IDF representation are built, with configurable n-gram range and vocabulary size.</w:t>
+        <w:t>Raw Wikipedia text is noisy for modelling purposes, so before anything is indexed it goes through a cleaning pass: lowercase, keep only alphabetic tokens of two or more letters, drop common English stopwords, and then normalize what's left — either by lemmatizing (WordNetLemmatizer), stemming (PorterStemmer), or leaving it as-is, depending on which configuration is being tested. From the cleaned text, both a bag-of-words representation and a TF-IDF representation are built, with configurable n-gram range and vocabulary size.</w:t>
       </w:r>
     </w:p>
     <w:p>
       <w:r>
-        <w:t>Because there's more than one reasonable way to do that cleaning, the Performance Analytics page runs a small experiment rather than just picking one: it tries three normalization modes × two n-gram settings × two feature types (twelve combinations total</w:t>
-      </w:r>
-      <w:proofErr w:type="gramStart"/>
-      <w:r>
-        <w:t>), and</w:t>
-      </w:r>
-      <w:proofErr w:type="gramEnd"/>
-      <w:r>
-        <w:t xml:space="preserve"> scores each one by how well a Naive Bayes classifier can predict a document's topic from it, using 4-fold cross-validation. The results were reasonably </w:t>
-      </w:r>
-      <w:proofErr w:type="gramStart"/>
-      <w:r>
-        <w:t>clear-cut</w:t>
-      </w:r>
-      <w:proofErr w:type="gramEnd"/>
-      <w:r>
-        <w:t>:</w:t>
+        <w:lastRenderedPageBreak/>
+        <w:t>Because there's more than one reasonable way to do that cleaning, the Performance Analytics page runs a small experiment rather than just picking one: it tries three normalization modes × two n-gram settings × two feature types (twelve combinations total), and scores each one by how well a Naive Bayes classifier can predict a document's topic from it, using 4-fold cross-validation. The results were reasonably clear-cut:</w:t>
       </w:r>
     </w:p>
     <w:tbl>
@@ -1314,11 +1362,9 @@
             <w:pPr>
               <w:cnfStyle w:val="000000010000" w:firstRow="0" w:lastRow="0" w:firstColumn="0" w:lastColumn="0" w:oddVBand="0" w:evenVBand="0" w:oddHBand="0" w:evenHBand="1" w:firstRowFirstColumn="0" w:firstRowLastColumn="0" w:lastRowFirstColumn="0" w:lastRowLastColumn="0"/>
             </w:pPr>
-            <w:proofErr w:type="spellStart"/>
             <w:r>
               <w:t>unigram+bigram</w:t>
             </w:r>
-            <w:proofErr w:type="spellEnd"/>
           </w:p>
         </w:tc>
         <w:tc>
@@ -1480,11 +1526,9 @@
             <w:pPr>
               <w:cnfStyle w:val="000000010000" w:firstRow="0" w:lastRow="0" w:firstColumn="0" w:lastColumn="0" w:oddVBand="0" w:evenVBand="0" w:oddHBand="0" w:evenHBand="1" w:firstRowFirstColumn="0" w:firstRowLastColumn="0" w:lastRowFirstColumn="0" w:lastRowLastColumn="0"/>
             </w:pPr>
-            <w:proofErr w:type="spellStart"/>
             <w:r>
               <w:t>unigram+bigram</w:t>
             </w:r>
-            <w:proofErr w:type="spellEnd"/>
           </w:p>
         </w:tc>
         <w:tc>
@@ -1567,7 +1611,7 @@
                     <pic:cNvPicPr/>
                   </pic:nvPicPr>
                   <pic:blipFill>
-                    <a:blip r:embed="rId7"/>
+                    <a:blip r:embed="rId12"/>
                     <a:stretch>
                       <a:fillRect/>
                     </a:stretch>
@@ -1624,7 +1668,7 @@
                     <pic:cNvPicPr/>
                   </pic:nvPicPr>
                   <pic:blipFill>
-                    <a:blip r:embed="rId8"/>
+                    <a:blip r:embed="rId13"/>
                     <a:stretch>
                       <a:fillRect/>
                     </a:stretch>
@@ -1692,7 +1736,7 @@
                     <pic:cNvPicPr/>
                   </pic:nvPicPr>
                   <pic:blipFill>
-                    <a:blip r:embed="rId9"/>
+                    <a:blip r:embed="rId14"/>
                     <a:stretch>
                       <a:fillRect/>
                     </a:stretch>
@@ -1749,7 +1793,7 @@
                     <pic:cNvPicPr/>
                   </pic:nvPicPr>
                   <pic:blipFill>
-                    <a:blip r:embed="rId10"/>
+                    <a:blip r:embed="rId15"/>
                     <a:stretch>
                       <a:fillRect/>
                     </a:stretch>
@@ -1984,7 +2028,7 @@
                     <pic:cNvPicPr/>
                   </pic:nvPicPr>
                   <pic:blipFill>
-                    <a:blip r:embed="rId11"/>
+                    <a:blip r:embed="rId16"/>
                     <a:stretch>
                       <a:fillRect/>
                     </a:stretch>
@@ -2028,49 +2072,17 @@
     </w:p>
     <w:p>
       <w:r>
-        <w:t xml:space="preserve">Two indexes back the search page: an inverted index mapping each term to the documents it appears in (used to quickly narrow down candidates before doing anything expensive), and a TF-IDF vector index used for cosine-similarity scoring. A third structure, a directed graph of which articles link to which, is used purely for ranking and recommendation — it only keeps links between documents that are </w:t>
-      </w:r>
-      <w:proofErr w:type="gramStart"/>
-      <w:r>
-        <w:t>actually in</w:t>
-      </w:r>
-      <w:proofErr w:type="gramEnd"/>
-      <w:r>
-        <w:t xml:space="preserve"> the corpus, since a link out to the rest of Wikipedia carries no useful ranking signal here.</w:t>
+        <w:t>Two indexes back the search page: an inverted index mapping each term to the documents it appears in (used to quickly narrow down candidates before doing anything expensive), and a TF-IDF vector index used for cosine-similarity scoring. A third structure, a directed graph of which articles link to which, is used purely for ranking and recommendation — it only keeps links between documents that are actually in the corpus, since a link out to the rest of Wikipedia carries no useful ranking signal here.</w:t>
       </w:r>
     </w:p>
     <w:p>
       <w:r>
-        <w:t xml:space="preserve">A query first gets cleaned the same way documents were (lowercased, </w:t>
-      </w:r>
-      <w:proofErr w:type="spellStart"/>
-      <w:r>
-        <w:t>stopwords</w:t>
-      </w:r>
-      <w:proofErr w:type="spellEnd"/>
-      <w:r>
-        <w:t xml:space="preserve"> removed, lemmatized) so it lands in the same vector </w:t>
-      </w:r>
-      <w:proofErr w:type="gramStart"/>
-      <w:r>
-        <w:t>space, and</w:t>
-      </w:r>
-      <w:proofErr w:type="gramEnd"/>
-      <w:r>
-        <w:t xml:space="preserve"> optionally expanded with a couple of WordNet synonyms per word. The inverted index then filters candidates — either “must contain any query term” or “must contain all of them” — before cosine similarity is computed only against that shortlist, rather than the whole collection.</w:t>
+        <w:t>A query first gets cleaned the same way documents were (lowercased, stopwords removed, lemmatized) so it lands in the same vector space, and optionally expanded with a couple of WordNet synonyms per word. The inverted index then filters candidates — either “must contain any query term” or “must contain all of them” — before cosine similarity is computed only against that shortlist, rather than the whole collection.</w:t>
       </w:r>
     </w:p>
     <w:p>
       <w:r>
-        <w:t xml:space="preserve">On top of plain content similarity, the link graph feeds PageRank and HITS (via </w:t>
-      </w:r>
-      <w:proofErr w:type="spellStart"/>
-      <w:r>
-        <w:t>networkx</w:t>
-      </w:r>
-      <w:proofErr w:type="spellEnd"/>
-      <w:r>
-        <w:t>), and the two are combined with a simple weighted average:</w:t>
+        <w:t>On top of plain content similarity, the link graph feeds PageRank and HITS (via networkx), and the two are combined with a simple weighted average:</w:t>
       </w:r>
     </w:p>
     <w:p>
@@ -2078,35 +2090,7 @@
         <w:rPr>
           <w:b/>
         </w:rPr>
-        <w:t xml:space="preserve">final </w:t>
-      </w:r>
-      <w:proofErr w:type="gramStart"/>
-      <w:r>
-        <w:rPr>
-          <w:b/>
-        </w:rPr>
-        <w:t>score  =</w:t>
-      </w:r>
-      <w:proofErr w:type="gramEnd"/>
-      <w:r>
-        <w:rPr>
-          <w:b/>
-        </w:rPr>
-        <w:t xml:space="preserve">  alpha × content </w:t>
-      </w:r>
-      <w:proofErr w:type="gramStart"/>
-      <w:r>
-        <w:rPr>
-          <w:b/>
-        </w:rPr>
-        <w:t>score  +</w:t>
-      </w:r>
-      <w:proofErr w:type="gramEnd"/>
-      <w:r>
-        <w:rPr>
-          <w:b/>
-        </w:rPr>
-        <w:t xml:space="preserve">  (1 − alpha) × link score</w:t>
+        <w:t>final score  =  alpha × content score  +  (1 − alpha) × link score</w:t>
       </w:r>
     </w:p>
     <w:p>
@@ -2574,106 +2558,99 @@
       </w:r>
     </w:p>
     <w:p>
-      <w:pPr>
-        <w:pBdr>
-          <w:top w:val="single" w:sz="12" w:space="4" w:color="C00000"/>
-          <w:left w:val="single" w:sz="12" w:space="4" w:color="C00000"/>
-          <w:bottom w:val="single" w:sz="12" w:space="4" w:color="C00000"/>
-          <w:right w:val="single" w:sz="12" w:space="4" w:color="C00000"/>
-        </w:pBdr>
-        <w:spacing w:before="120" w:after="200"/>
-      </w:pPr>
-      <w:proofErr w:type="gramStart"/>
       <w:r>
-        <w:rPr>
-          <w:b/>
-          <w:color w:val="C00000"/>
-          <w:sz w:val="20"/>
-        </w:rPr>
-        <w:t>[ Add</w:t>
+        <w:t xml:space="preserve">Search </w:t>
       </w:r>
-      <w:proofErr w:type="gramEnd"/>
       <w:r>
-        <w:rPr>
-          <w:b/>
-          <w:color w:val="C00000"/>
-          <w:sz w:val="20"/>
-        </w:rPr>
-        <w:t xml:space="preserve"> a screenshot here — the Search page — a query, its ranked results, and the content-vs-hybrid </w:t>
+        <w:drawing>
+          <wp:inline distT="0" distB="0" distL="0" distR="0" wp14:anchorId="5DEF3394" wp14:editId="0C3BFD8E">
+            <wp:extent cx="5486400" cy="3084195"/>
+            <wp:effectExtent l="0" t="0" r="0" b="1905"/>
+            <wp:docPr id="302023420" name="Picture 1"/>
+            <wp:cNvGraphicFramePr>
+              <a:graphicFrameLocks xmlns:a="http://schemas.openxmlformats.org/drawingml/2006/main" noChangeAspect="1"/>
+            </wp:cNvGraphicFramePr>
+            <a:graphic xmlns:a="http://schemas.openxmlformats.org/drawingml/2006/main">
+              <a:graphicData uri="http://schemas.openxmlformats.org/drawingml/2006/picture">
+                <pic:pic xmlns:pic="http://schemas.openxmlformats.org/drawingml/2006/picture">
+                  <pic:nvPicPr>
+                    <pic:cNvPr id="302023420" name=""/>
+                    <pic:cNvPicPr/>
+                  </pic:nvPicPr>
+                  <pic:blipFill>
+                    <a:blip r:embed="rId17"/>
+                    <a:stretch>
+                      <a:fillRect/>
+                    </a:stretch>
+                  </pic:blipFill>
+                  <pic:spPr>
+                    <a:xfrm>
+                      <a:off x="0" y="0"/>
+                      <a:ext cx="5486400" cy="3084195"/>
+                    </a:xfrm>
+                    <a:prstGeom prst="rect">
+                      <a:avLst/>
+                    </a:prstGeom>
+                  </pic:spPr>
+                </pic:pic>
+              </a:graphicData>
+            </a:graphic>
+          </wp:inline>
+        </w:drawing>
       </w:r>
-      <w:proofErr w:type="gramStart"/>
+    </w:p>
+    <w:p/>
+    <w:p>
       <w:r>
-        <w:rPr>
-          <w:b/>
-          <w:color w:val="C00000"/>
-          <w:sz w:val="20"/>
-        </w:rPr>
-        <w:t>comparison ]</w:t>
+        <w:t>Ranking</w:t>
       </w:r>
-      <w:proofErr w:type="gramEnd"/>
     </w:p>
     <w:p>
-      <w:pPr>
-        <w:pBdr>
-          <w:top w:val="single" w:sz="12" w:space="4" w:color="C00000"/>
-          <w:left w:val="single" w:sz="12" w:space="4" w:color="C00000"/>
-          <w:bottom w:val="single" w:sz="12" w:space="4" w:color="C00000"/>
-          <w:right w:val="single" w:sz="12" w:space="4" w:color="C00000"/>
-        </w:pBdr>
-        <w:spacing w:before="120" w:after="200"/>
-      </w:pPr>
-      <w:proofErr w:type="gramStart"/>
       <w:r>
-        <w:rPr>
-          <w:b/>
-          <w:color w:val="C00000"/>
-          <w:sz w:val="20"/>
-        </w:rPr>
-        <w:t>[ Add</w:t>
+        <w:drawing>
+          <wp:inline distT="0" distB="0" distL="0" distR="0" wp14:anchorId="110075D7" wp14:editId="2D4883C4">
+            <wp:extent cx="5486400" cy="3084195"/>
+            <wp:effectExtent l="0" t="0" r="0" b="1905"/>
+            <wp:docPr id="397722822" name="Picture 1"/>
+            <wp:cNvGraphicFramePr>
+              <a:graphicFrameLocks xmlns:a="http://schemas.openxmlformats.org/drawingml/2006/main" noChangeAspect="1"/>
+            </wp:cNvGraphicFramePr>
+            <a:graphic xmlns:a="http://schemas.openxmlformats.org/drawingml/2006/main">
+              <a:graphicData uri="http://schemas.openxmlformats.org/drawingml/2006/picture">
+                <pic:pic xmlns:pic="http://schemas.openxmlformats.org/drawingml/2006/picture">
+                  <pic:nvPicPr>
+                    <pic:cNvPr id="397722822" name=""/>
+                    <pic:cNvPicPr/>
+                  </pic:nvPicPr>
+                  <pic:blipFill>
+                    <a:blip r:embed="rId18"/>
+                    <a:stretch>
+                      <a:fillRect/>
+                    </a:stretch>
+                  </pic:blipFill>
+                  <pic:spPr>
+                    <a:xfrm>
+                      <a:off x="0" y="0"/>
+                      <a:ext cx="5486400" cy="3084195"/>
+                    </a:xfrm>
+                    <a:prstGeom prst="rect">
+                      <a:avLst/>
+                    </a:prstGeom>
+                  </pic:spPr>
+                </pic:pic>
+              </a:graphicData>
+            </a:graphic>
+          </wp:inline>
+        </w:drawing>
       </w:r>
-      <w:proofErr w:type="gramEnd"/>
-      <w:r>
-        <w:rPr>
-          <w:b/>
-          <w:color w:val="C00000"/>
-          <w:sz w:val="20"/>
-        </w:rPr>
-        <w:t xml:space="preserve"> a screenshot here — the Ranking page — the link-graph visualization and the </w:t>
-      </w:r>
-      <w:proofErr w:type="gramStart"/>
-      <w:r>
-        <w:rPr>
-          <w:b/>
-          <w:color w:val="C00000"/>
-          <w:sz w:val="20"/>
-        </w:rPr>
-        <w:t>top-10</w:t>
-      </w:r>
-      <w:proofErr w:type="gramEnd"/>
-      <w:r>
-        <w:rPr>
-          <w:b/>
-          <w:color w:val="C00000"/>
-          <w:sz w:val="20"/>
-        </w:rPr>
-        <w:t xml:space="preserve"> PageRank/HITS </w:t>
-      </w:r>
-      <w:proofErr w:type="gramStart"/>
-      <w:r>
-        <w:rPr>
-          <w:b/>
-          <w:color w:val="C00000"/>
-          <w:sz w:val="20"/>
-        </w:rPr>
-        <w:t>chart ]</w:t>
-      </w:r>
-      <w:proofErr w:type="gramEnd"/>
     </w:p>
+    <w:p/>
     <w:p>
       <w:pPr>
         <w:pStyle w:val="Heading1"/>
       </w:pPr>
       <w:r>
+        <w:lastRenderedPageBreak/>
         <w:t>Recommending related articles</w:t>
       </w:r>
     </w:p>
@@ -3063,68 +3040,50 @@
       </w:r>
     </w:p>
     <w:p>
-      <w:pPr>
-        <w:pBdr>
-          <w:top w:val="single" w:sz="12" w:space="4" w:color="C00000"/>
-          <w:left w:val="single" w:sz="12" w:space="4" w:color="C00000"/>
-          <w:bottom w:val="single" w:sz="12" w:space="4" w:color="C00000"/>
-          <w:right w:val="single" w:sz="12" w:space="4" w:color="C00000"/>
-        </w:pBdr>
-        <w:spacing w:before="120" w:after="200"/>
-      </w:pPr>
-      <w:proofErr w:type="gramStart"/>
       <w:r>
-        <w:rPr>
-          <w:b/>
-          <w:color w:val="C00000"/>
-          <w:sz w:val="20"/>
-        </w:rPr>
-        <w:t>[ Add</w:t>
+        <w:lastRenderedPageBreak/>
+        <w:drawing>
+          <wp:inline distT="0" distB="0" distL="0" distR="0" wp14:anchorId="249EC1BA" wp14:editId="09056752">
+            <wp:extent cx="5486400" cy="3084195"/>
+            <wp:effectExtent l="0" t="0" r="0" b="1905"/>
+            <wp:docPr id="353631094" name="Picture 1"/>
+            <wp:cNvGraphicFramePr>
+              <a:graphicFrameLocks xmlns:a="http://schemas.openxmlformats.org/drawingml/2006/main" noChangeAspect="1"/>
+            </wp:cNvGraphicFramePr>
+            <a:graphic xmlns:a="http://schemas.openxmlformats.org/drawingml/2006/main">
+              <a:graphicData uri="http://schemas.openxmlformats.org/drawingml/2006/picture">
+                <pic:pic xmlns:pic="http://schemas.openxmlformats.org/drawingml/2006/picture">
+                  <pic:nvPicPr>
+                    <pic:cNvPr id="353631094" name=""/>
+                    <pic:cNvPicPr/>
+                  </pic:nvPicPr>
+                  <pic:blipFill>
+                    <a:blip r:embed="rId19"/>
+                    <a:stretch>
+                      <a:fillRect/>
+                    </a:stretch>
+                  </pic:blipFill>
+                  <pic:spPr>
+                    <a:xfrm>
+                      <a:off x="0" y="0"/>
+                      <a:ext cx="5486400" cy="3084195"/>
+                    </a:xfrm>
+                    <a:prstGeom prst="rect">
+                      <a:avLst/>
+                    </a:prstGeom>
+                  </pic:spPr>
+                </pic:pic>
+              </a:graphicData>
+            </a:graphic>
+          </wp:inline>
+        </w:drawing>
       </w:r>
-      <w:proofErr w:type="gramEnd"/>
-      <w:r>
-        <w:rPr>
-          <w:b/>
-          <w:color w:val="C00000"/>
-          <w:sz w:val="20"/>
-        </w:rPr>
-        <w:t xml:space="preserve"> a screenshot here — the Recommendations page — picking a document and viewing its </w:t>
-      </w:r>
-      <w:proofErr w:type="gramStart"/>
-      <w:r>
-        <w:rPr>
-          <w:b/>
-          <w:color w:val="C00000"/>
-          <w:sz w:val="20"/>
-        </w:rPr>
-        <w:t>top-K</w:t>
-      </w:r>
-      <w:proofErr w:type="gramEnd"/>
-      <w:r>
-        <w:rPr>
-          <w:b/>
-          <w:color w:val="C00000"/>
-          <w:sz w:val="20"/>
-        </w:rPr>
-        <w:t xml:space="preserve"> </w:t>
-      </w:r>
-      <w:proofErr w:type="gramStart"/>
-      <w:r>
-        <w:rPr>
-          <w:b/>
-          <w:color w:val="C00000"/>
-          <w:sz w:val="20"/>
-        </w:rPr>
-        <w:t>recommendations ]</w:t>
-      </w:r>
-      <w:proofErr w:type="gramEnd"/>
     </w:p>
     <w:p>
       <w:pPr>
         <w:pStyle w:val="Heading1"/>
       </w:pPr>
       <w:r>
-        <w:lastRenderedPageBreak/>
         <w:t>Measuring how well it works</w:t>
       </w:r>
     </w:p>
@@ -3739,6 +3698,7 @@
           </w:tcPr>
           <w:p>
             <w:r>
+              <w:lastRenderedPageBreak/>
               <w:t>HITS only</w:t>
             </w:r>
           </w:p>
@@ -3861,7 +3821,7 @@
                     <pic:cNvPicPr/>
                   </pic:nvPicPr>
                   <pic:blipFill>
-                    <a:blip r:embed="rId12"/>
+                    <a:blip r:embed="rId20"/>
                     <a:stretch>
                       <a:fillRect/>
                     </a:stretch>
@@ -3891,7 +3851,6 @@
           <w:i/>
           <w:sz w:val="18"/>
         </w:rPr>
-        <w:lastRenderedPageBreak/>
         <w:t>MAP, MRR, NDCG@5 and F1 across the five ranking methods</w:t>
       </w:r>
     </w:p>
@@ -3906,83 +3865,96 @@
       </w:r>
     </w:p>
     <w:p>
-      <w:pPr>
-        <w:pBdr>
-          <w:top w:val="single" w:sz="12" w:space="4" w:color="C00000"/>
-          <w:left w:val="single" w:sz="12" w:space="4" w:color="C00000"/>
-          <w:bottom w:val="single" w:sz="12" w:space="4" w:color="C00000"/>
-          <w:right w:val="single" w:sz="12" w:space="4" w:color="C00000"/>
-        </w:pBdr>
-        <w:spacing w:before="120" w:after="200"/>
-      </w:pPr>
-      <w:proofErr w:type="gramStart"/>
       <w:r>
-        <w:rPr>
-          <w:b/>
-          <w:color w:val="C00000"/>
-          <w:sz w:val="20"/>
-        </w:rPr>
-        <w:t>[ Add</w:t>
+        <w:t>Evaluation</w:t>
       </w:r>
-      <w:proofErr w:type="gramEnd"/>
-      <w:r>
-        <w:rPr>
-          <w:b/>
-          <w:color w:val="C00000"/>
-          <w:sz w:val="20"/>
-        </w:rPr>
-        <w:t xml:space="preserve"> a screenshot here — the Evaluation page — the method comparison table, chart, and per-query </w:t>
-      </w:r>
-      <w:proofErr w:type="gramStart"/>
-      <w:r>
-        <w:rPr>
-          <w:b/>
-          <w:color w:val="C00000"/>
-          <w:sz w:val="20"/>
-        </w:rPr>
-        <w:t>breakdown ]</w:t>
-      </w:r>
-      <w:proofErr w:type="gramEnd"/>
     </w:p>
     <w:p>
-      <w:pPr>
-        <w:pBdr>
-          <w:top w:val="single" w:sz="12" w:space="4" w:color="C00000"/>
-          <w:left w:val="single" w:sz="12" w:space="4" w:color="C00000"/>
-          <w:bottom w:val="single" w:sz="12" w:space="4" w:color="C00000"/>
-          <w:right w:val="single" w:sz="12" w:space="4" w:color="C00000"/>
-        </w:pBdr>
-        <w:spacing w:before="120" w:after="200"/>
-      </w:pPr>
-      <w:proofErr w:type="gramStart"/>
       <w:r>
-        <w:rPr>
-          <w:b/>
-          <w:color w:val="C00000"/>
-          <w:sz w:val="20"/>
-        </w:rPr>
-        <w:t>[ Add</w:t>
+        <w:lastRenderedPageBreak/>
+        <w:drawing>
+          <wp:inline distT="0" distB="0" distL="0" distR="0" wp14:anchorId="01F4C92F" wp14:editId="5C449750">
+            <wp:extent cx="5486400" cy="3084195"/>
+            <wp:effectExtent l="0" t="0" r="0" b="1905"/>
+            <wp:docPr id="1790402071" name="Picture 1"/>
+            <wp:cNvGraphicFramePr>
+              <a:graphicFrameLocks xmlns:a="http://schemas.openxmlformats.org/drawingml/2006/main" noChangeAspect="1"/>
+            </wp:cNvGraphicFramePr>
+            <a:graphic xmlns:a="http://schemas.openxmlformats.org/drawingml/2006/main">
+              <a:graphicData uri="http://schemas.openxmlformats.org/drawingml/2006/picture">
+                <pic:pic xmlns:pic="http://schemas.openxmlformats.org/drawingml/2006/picture">
+                  <pic:nvPicPr>
+                    <pic:cNvPr id="1790402071" name=""/>
+                    <pic:cNvPicPr/>
+                  </pic:nvPicPr>
+                  <pic:blipFill>
+                    <a:blip r:embed="rId21"/>
+                    <a:stretch>
+                      <a:fillRect/>
+                    </a:stretch>
+                  </pic:blipFill>
+                  <pic:spPr>
+                    <a:xfrm>
+                      <a:off x="0" y="0"/>
+                      <a:ext cx="5486400" cy="3084195"/>
+                    </a:xfrm>
+                    <a:prstGeom prst="rect">
+                      <a:avLst/>
+                    </a:prstGeom>
+                  </pic:spPr>
+                </pic:pic>
+              </a:graphicData>
+            </a:graphic>
+          </wp:inline>
+        </w:drawing>
       </w:r>
-      <w:proofErr w:type="gramEnd"/>
+    </w:p>
+    <w:p/>
+    <w:p>
       <w:r>
-        <w:rPr>
-          <w:b/>
-          <w:color w:val="C00000"/>
-          <w:sz w:val="20"/>
-        </w:rPr>
-        <w:t xml:space="preserve"> a screenshot here — the Performance Analytics page — preprocessing/classification results and the runtime </w:t>
+        <w:t>Performance Analytics</w:t>
       </w:r>
-      <w:proofErr w:type="gramStart"/>
+    </w:p>
+    <w:p>
       <w:r>
-        <w:rPr>
-          <w:b/>
-          <w:color w:val="C00000"/>
-          <w:sz w:val="20"/>
-        </w:rPr>
-        <w:t>benchmark ]</w:t>
+        <w:drawing>
+          <wp:inline distT="0" distB="0" distL="0" distR="0" wp14:anchorId="73DD4A06" wp14:editId="55162636">
+            <wp:extent cx="5486400" cy="3084195"/>
+            <wp:effectExtent l="0" t="0" r="0" b="1905"/>
+            <wp:docPr id="2139445007" name="Picture 1"/>
+            <wp:cNvGraphicFramePr>
+              <a:graphicFrameLocks xmlns:a="http://schemas.openxmlformats.org/drawingml/2006/main" noChangeAspect="1"/>
+            </wp:cNvGraphicFramePr>
+            <a:graphic xmlns:a="http://schemas.openxmlformats.org/drawingml/2006/main">
+              <a:graphicData uri="http://schemas.openxmlformats.org/drawingml/2006/picture">
+                <pic:pic xmlns:pic="http://schemas.openxmlformats.org/drawingml/2006/picture">
+                  <pic:nvPicPr>
+                    <pic:cNvPr id="2139445007" name=""/>
+                    <pic:cNvPicPr/>
+                  </pic:nvPicPr>
+                  <pic:blipFill>
+                    <a:blip r:embed="rId22"/>
+                    <a:stretch>
+                      <a:fillRect/>
+                    </a:stretch>
+                  </pic:blipFill>
+                  <pic:spPr>
+                    <a:xfrm>
+                      <a:off x="0" y="0"/>
+                      <a:ext cx="5486400" cy="3084195"/>
+                    </a:xfrm>
+                    <a:prstGeom prst="rect">
+                      <a:avLst/>
+                    </a:prstGeom>
+                  </pic:spPr>
+                </pic:pic>
+              </a:graphicData>
+            </a:graphic>
+          </wp:inline>
+        </w:drawing>
       </w:r>
-      <w:proofErr w:type="gramEnd"/>
     </w:p>
+    <w:p/>
     <w:p>
       <w:pPr>
         <w:pStyle w:val="Heading1"/>
@@ -3993,60 +3965,7 @@
     </w:p>
     <w:p>
       <w:r>
-        <w:t xml:space="preserve">A few things stood out while building and testing this, worth calling out explicitly rather than leaving </w:t>
-      </w:r>
-      <w:proofErr w:type="gramStart"/>
-      <w:r>
-        <w:t>implicit</w:t>
-      </w:r>
-      <w:proofErr w:type="gramEnd"/>
-      <w:r>
-        <w:t xml:space="preserve"> in the numbers above.</w:t>
-      </w:r>
-    </w:p>
-    <w:p>
-      <w:pPr>
-        <w:pStyle w:val="Heading2"/>
-      </w:pPr>
-      <w:r>
-        <w:t xml:space="preserve">Why </w:t>
-      </w:r>
-      <w:proofErr w:type="gramStart"/>
-      <w:r>
-        <w:t>relevant documents can</w:t>
-      </w:r>
-      <w:proofErr w:type="gramEnd"/>
-      <w:r>
-        <w:t xml:space="preserve"> rank poorly</w:t>
-      </w:r>
-    </w:p>
-    <w:p>
-      <w:r>
-        <w:t xml:space="preserve">The clearest example of this in the system is the “Artificial intelligence” case from the ranking section above: a document with weak content similarity to a query can still outrank much more relevant ones, purely because it's heavily linked. That happens because the link graph here is small — 61 pages, 300 edges — so authority concentrates </w:t>
-      </w:r>
-      <w:proofErr w:type="gramStart"/>
-      <w:r>
-        <w:t>in</w:t>
-      </w:r>
-      <w:proofErr w:type="gramEnd"/>
-      <w:r>
-        <w:t xml:space="preserve"> a few hub pages rather than spreading out proportionally to actual relevance. A related but opposite problem is that plain TF-IDF matching misses documents that are relevant but phrased differently — query expansion exists to help with that but isn't switched on by default. And because there's no phrase or proximity scoring, a document where the query words happen to appear far apart scores </w:t>
-      </w:r>
-      <w:proofErr w:type="gramStart"/>
-      <w:r>
-        <w:t>exactly the same</w:t>
-      </w:r>
-      <w:proofErr w:type="gramEnd"/>
-      <w:r>
-        <w:t xml:space="preserve"> as one where they appear together meaningfully. The fixes that seem most worth trying </w:t>
-      </w:r>
-      <w:proofErr w:type="gramStart"/>
-      <w:r>
-        <w:t>are:</w:t>
-      </w:r>
-      <w:proofErr w:type="gramEnd"/>
-      <w:r>
-        <w:t xml:space="preserve"> tuning the alpha blend against the evaluation numbers instead of leaving it at a fixed default (the evaluation above already shows 0.7 isn't ideal for this corpus), using a topic-aware version of PageRank instead of a single global one, turning query expansion on by default, and eventually growing the corpus so link authority has more to work with.</w:t>
+        <w:t>A few things stood out while building and testing this, worth calling out explicitly rather than leaving implicit in the numbers above.</w:t>
       </w:r>
     </w:p>
     <w:p>
@@ -4055,6 +3974,19 @@
       </w:pPr>
       <w:r>
         <w:lastRenderedPageBreak/>
+        <w:t>Why relevant documents can rank poorly</w:t>
+      </w:r>
+    </w:p>
+    <w:p>
+      <w:r>
+        <w:t>The clearest example of this in the system is the “Artificial intelligence” case from the ranking section above: a document with weak content similarity to a query can still outrank much more relevant ones, purely because it's heavily linked. That happens because the link graph here is small — 61 pages, 300 edges — so authority concentrates in a few hub pages rather than spreading out proportionally to actual relevance. A related but opposite problem is that plain TF-IDF matching misses documents that are relevant but phrased differently — query expansion exists to help with that but isn't switched on by default. And because there's no phrase or proximity scoring, a document where the query words happen to appear far apart scores exactly the same as one where they appear together meaningfully. The fixes that seem most worth trying are: tuning the alpha blend against the evaluation numbers instead of leaving it at a fixed default (the evaluation above already shows 0.7 isn't ideal for this corpus), using a topic-aware version of PageRank instead of a single global one, turning query expansion on by default, and eventually growing the corpus so link authority has more to work with.</w:t>
+      </w:r>
+    </w:p>
+    <w:p>
+      <w:pPr>
+        <w:pStyle w:val="Heading2"/>
+      </w:pPr>
+      <w:r>
         <w:t>What duplicate documents would break</w:t>
       </w:r>
     </w:p>
@@ -4065,15 +3997,7 @@
     </w:p>
     <w:p>
       <w:r>
-        <w:t xml:space="preserve">This is exactly why the crawler checks for exact duplicates (by hashing page text) and near-duplicates (by comparing word overlap, at a similarity cutoff of 0.85) before saving anything — one exact duplicate was in fact caught and dropped during the actual crawl this report is based on. The one gap worth flagging: the second way of adding documents, uploading a CSV, skips that check entirely, so anything added that way is trusted as unique without verification. A reasonable next step would be running the same duplicate check on that path </w:t>
-      </w:r>
-      <w:proofErr w:type="gramStart"/>
-      <w:r>
-        <w:t>too, and</w:t>
-      </w:r>
-      <w:proofErr w:type="gramEnd"/>
-      <w:r>
-        <w:t xml:space="preserve"> adding some diversity-aware re-ranking as a backstop for near-duplicates that slip through either way.</w:t>
+        <w:t>This is exactly why the crawler checks for exact duplicates (by hashing page text) and near-duplicates (by comparing word overlap, at a similarity cutoff of 0.85) before saving anything — one exact duplicate was in fact caught and dropped during the actual crawl this report is based on. The one gap worth flagging: the second way of adding documents, uploading a CSV, skips that check entirely, so anything added that way is trusted as unique without verification. A reasonable next step would be running the same duplicate check on that path too, and adding some diversity-aware re-ranking as a backstop for near-duplicates that slip through either way.</w:t>
       </w:r>
     </w:p>
     <w:p>
@@ -4086,43 +4010,12 @@
     </w:p>
     <w:p>
       <w:r>
-        <w:t xml:space="preserve">This system only implements content-based and graph-based </w:t>
-      </w:r>
-      <w:proofErr w:type="gramStart"/>
-      <w:r>
-        <w:t>recommendation</w:t>
-      </w:r>
-      <w:proofErr w:type="gramEnd"/>
-      <w:r>
-        <w:t xml:space="preserve"> (plus a hybrid of the </w:t>
-      </w:r>
-      <w:proofErr w:type="gramStart"/>
-      <w:r>
-        <w:t>two) —</w:t>
-      </w:r>
-      <w:proofErr w:type="gramEnd"/>
-      <w:r>
-        <w:t xml:space="preserve"> not collaborative filtering, which recommends based on what other users with similar taste have liked. The reason is simple: collaborative filtering needs a history of user interactions to work </w:t>
-      </w:r>
-      <w:proofErr w:type="gramStart"/>
-      <w:r>
-        <w:t>from</w:t>
-      </w:r>
-      <w:proofErr w:type="gramEnd"/>
-      <w:r>
-        <w:t xml:space="preserve">, and a freshly crawled Wikipedia corpus has none. </w:t>
-      </w:r>
-      <w:proofErr w:type="gramStart"/>
-      <w:r>
-        <w:t>So</w:t>
-      </w:r>
-      <w:proofErr w:type="gramEnd"/>
-      <w:r>
-        <w:t xml:space="preserve"> the comparison here is more conceptual than measured.</w:t>
+        <w:t>This system only implements content-based and graph-based recommendation (plus a hybrid of the two) — not collaborative filtering, which recommends based on what other users with similar taste have liked. The reason is simple: collaborative filtering needs a history of user interactions to work from, and a freshly crawled Wikipedia corpus has none. So the comparison here is more conceptual than measured.</w:t>
       </w:r>
     </w:p>
     <w:p>
       <w:r>
+        <w:lastRenderedPageBreak/>
         <w:t>Content-based recommendation works from day one, even for a brand-new document, because it only needs the document's own text — no waiting for anyone to interact with it. Collaborative filtering, by contrast, can't say anything useful about a new item until enough people have engaged with it, and can't personalize for a new user until they've interacted with enough items themselves. In exchange, collaborative filtering can surface genuinely surprising connections — two articles that share no vocabulary at all but that the same readers keep coming back to — which content similarity can never find, by definition, since it only ever looks at the document's own text. Content-based recommendation tends to feel a little narrow over time for the same reason: it keeps suggesting near-variations of what you already looked at. In short, content-based fits a system like this one, where there's text but no user history; collaborative filtering becomes worth the extra effort once a real, active user base exists to learn from.</w:t>
       </w:r>
     </w:p>
@@ -4131,29 +4024,12 @@
         <w:pStyle w:val="Heading2"/>
       </w:pPr>
       <w:r>
-        <w:lastRenderedPageBreak/>
         <w:t>Why the pieces need to work together</w:t>
       </w:r>
     </w:p>
     <w:p>
       <w:r>
-        <w:t xml:space="preserve">None of these stages are useful in isolation. A crawler without duplicate detection poisons everything downstream of it. The choice of how text is cleaned and vectorized doesn't just affect search — the same TF-IDF representation is what the content-based recommender and the topic classifier both run on too, so the ~24% swing in classification score between preprocessing configurations shown earlier is really a statement about search and recommendation quality as well, not just classification. Search and recommendation turned out to share more machinery than expected — both use the exact same alpha-weighted blend of content similarity and link/graph authority, just applied to a query on one side and a seed document on the other. And evaluation is what </w:t>
-      </w:r>
-      <w:proofErr w:type="gramStart"/>
-      <w:r>
-        <w:t>actually closes</w:t>
-      </w:r>
-      <w:proofErr w:type="gramEnd"/>
-      <w:r>
-        <w:t xml:space="preserve"> the loop: without it, there'd be no way to know that content-only ranking beats the hybrid on this </w:t>
-      </w:r>
-      <w:proofErr w:type="gramStart"/>
-      <w:r>
-        <w:t>particular corpus</w:t>
-      </w:r>
-      <w:proofErr w:type="gramEnd"/>
-      <w:r>
-        <w:t>, or that the default alpha is probably too link-heavy — that's not something you'd guess by eye.</w:t>
+        <w:t>None of these stages are useful in isolation. A crawler without duplicate detection poisons everything downstream of it. The choice of how text is cleaned and vectorized doesn't just affect search — the same TF-IDF representation is what the content-based recommender and the topic classifier both run on too, so the ~24% swing in classification score between preprocessing configurations shown earlier is really a statement about search and recommendation quality as well, not just classification. Search and recommendation turned out to share more machinery than expected — both use the exact same alpha-weighted blend of content similarity and link/graph authority, just applied to a query on one side and a seed document on the other. And evaluation is what actually closes the loop: without it, there'd be no way to know that content-only ranking beats the hybrid on this particular corpus, or that the default alpha is probably too link-heavy — that's not something you'd guess by eye.</w:t>
       </w:r>
     </w:p>
     <w:p>
@@ -4161,89 +4037,16 @@
         <w:pStyle w:val="Heading2"/>
       </w:pPr>
       <w:r>
-        <w:t xml:space="preserve">What the results </w:t>
-      </w:r>
-      <w:proofErr w:type="gramStart"/>
-      <w:r>
-        <w:t>actually taught</w:t>
-      </w:r>
-      <w:proofErr w:type="gramEnd"/>
-      <w:r>
-        <w:t xml:space="preserve"> us</w:t>
+        <w:t>What the results actually taught us</w:t>
       </w:r>
     </w:p>
     <w:p>
       <w:r>
-        <w:t>Pulling together everything above, a few takeaways feel worth stating plainly. Content-based ranking beat pure link-based ranking by a wide margin on this corpus, which says more about corpus size than about PageRank/HITS being bad algorithms — they just need a denser link graph than 300 edges to be a reliable relevance signal. Blending two signals isn't automatically better than the stronger one alone; the hybrid sits between content-only and link-only here, not above content-only, so the blend ratio needs to be tuned against real evaluation numbers rather than assumed. How the text is preprocessed matters roughly as much as which ranking formula is used — a ~24% swing in classification score from normalization and n-gram choices alone is not a small effect. Naive Bayes beat Logistic Regression for topic classification here, most likely because the simpler model handles the very small per-class sample sizes better. Those same small sample sizes are the real bottleneck in the classification results — a topic with only two test documents can't score well no matter which model is used, so more data would help more than a better algorithm would. The duplicate-detection gap in the CSV upload path is a reminder that a safeguard built once for one entry point doesn't automatically cover every entry point. And the two recommendation methods genuinely disagree with each other in useful ways — content-based and graph-based each surfaced a different, reasonable notion of “related” for the same document — which is the actual argument for offering a hybrid instead of picking one and calling it done.</w:t>
+        <w:t xml:space="preserve">Pulling together everything above, a few takeaways feel worth stating plainly. Content-based ranking beat pure link-based ranking by a wide margin on this corpus, which says more about corpus size than about PageRank/HITS being bad algorithms — they just need a denser link graph than 300 edges to be a reliable relevance signal. Blending two signals isn't automatically better than the stronger one alone; the hybrid sits between content-only and link-only here, not above content-only, so the blend ratio needs to be tuned against real evaluation numbers rather than assumed. How the text is preprocessed matters roughly as much as which ranking formula is used — a ~24% swing in classification score from normalization and n-gram choices alone is not a small effect. Naive Bayes beat Logistic Regression for topic classification here, most likely because the simpler model handles the very small per-class sample sizes better. Those same small sample sizes are the real bottleneck in the classification results — a topic with only two test documents can't score </w:t>
       </w:r>
-    </w:p>
-    <w:p>
-      <w:pPr>
-        <w:pStyle w:val="Heading1"/>
-      </w:pPr>
       <w:r>
-        <w:t>Wrapping up</w:t>
-      </w:r>
-    </w:p>
-    <w:p>
-      <w:r>
-        <w:t>The code, the crawled dataset, and this report together cover the full pipeline described above. A few things are still worth doing before calling this finished:</w:t>
-      </w:r>
-    </w:p>
-    <w:p>
-      <w:pPr>
-        <w:pStyle w:val="ListBullet"/>
-      </w:pPr>
-      <w:r>
-        <w:t>Fill in the names/IDs and date on the cover page.</w:t>
-      </w:r>
-    </w:p>
-    <w:p>
-      <w:pPr>
-        <w:pBdr>
-          <w:top w:val="single" w:sz="12" w:space="4" w:color="C00000"/>
-          <w:left w:val="single" w:sz="12" w:space="4" w:color="C00000"/>
-          <w:bottom w:val="single" w:sz="12" w:space="4" w:color="C00000"/>
-          <w:right w:val="single" w:sz="12" w:space="4" w:color="C00000"/>
-        </w:pBdr>
-        <w:spacing w:before="120" w:after="200"/>
-      </w:pPr>
-      <w:proofErr w:type="gramStart"/>
-      <w:r>
-        <w:rPr>
-          <w:b/>
-          <w:color w:val="C00000"/>
-          <w:sz w:val="20"/>
-        </w:rPr>
         <w:lastRenderedPageBreak/>
-        <w:t>[ Add</w:t>
-      </w:r>
-      <w:proofErr w:type="gramEnd"/>
-      <w:r>
-        <w:rPr>
-          <w:b/>
-          <w:color w:val="C00000"/>
-          <w:sz w:val="20"/>
-        </w:rPr>
-        <w:t xml:space="preserve"> a screenshot here — the remaining screenshots above, plus a short recording of the app running end to </w:t>
-      </w:r>
-      <w:proofErr w:type="gramStart"/>
-      <w:r>
-        <w:rPr>
-          <w:b/>
-          <w:color w:val="C00000"/>
-          <w:sz w:val="20"/>
-        </w:rPr>
-        <w:t>end ]</w:t>
-      </w:r>
-      <w:proofErr w:type="gramEnd"/>
-    </w:p>
-    <w:p>
-      <w:pPr>
-        <w:pStyle w:val="ListBullet"/>
-      </w:pPr>
-      <w:r>
-        <w:t>Double-check the README's install and run steps still match what's in requirements.txt.</w:t>
+        <w:t>well no matter which model is used, so more data would help more than a better algorithm would. The duplicate-detection gap in the CSV upload path is a reminder that a safeguard built once for one entry point doesn't automatically cover every entry point. And the two recommendation methods genuinely disagree with each other in useful ways — content-based and graph-based each surfaced a different, reasonable notion of “related” for the same document — which is the actual argument for offering a hybrid instead of picking one and calling it done.</w:t>
       </w:r>
     </w:p>
     <w:sectPr>
@@ -4257,7 +4060,7 @@
 </file>
 
 <file path=word/numbering.xml><?xml version="1.0" encoding="utf-8"?>
-<w:numbering xmlns:wpc="http://schemas.microsoft.com/office/word/2010/wordprocessingCanvas" xmlns:cx="http://schemas.microsoft.com/office/drawing/2014/chartex" xmlns:cx1="http://schemas.microsoft.com/office/drawing/2015/9/8/chartex" xmlns:cx2="http://schemas.microsoft.com/office/drawing/2015/10/21/chartex" xmlns:cx3="http://schemas.microsoft.com/office/drawing/2016/5/9/chartex" xmlns:cx4="http://schemas.microsoft.com/office/drawing/2016/5/10/chartex" xmlns:cx5="http://schemas.microsoft.com/office/drawing/2016/5/11/chartex" xmlns:cx6="http://schemas.microsoft.com/office/drawing/2016/5/12/chartex" xmlns:cx7="http://schemas.microsoft.com/office/drawing/2016/5/13/chartex" xmlns:cx8="http://schemas.microsoft.com/office/drawing/2016/5/14/chartex" xmlns:mc="http://schemas.openxmlformats.org/markup-compatibility/2006" xmlns:aink="http://schemas.microsoft.com/office/drawing/2016/ink" xmlns:am3d="http://schemas.microsoft.com/office/drawing/2017/model3d" xmlns:o="urn:schemas-microsoft-com:office:office" xmlns:oel="http://schemas.microsoft.com/office/2019/extlst" xmlns:r="http://schemas.openxmlformats.org/officeDocument/2006/relationships" xmlns:m="http://schemas.openxmlformats.org/officeDocument/2006/math" xmlns:v="urn:schemas-microsoft-com:vml" xmlns:wp14="http://schemas.microsoft.com/office/word/2010/wordprocessingDrawing" xmlns:wp="http://schemas.openxmlformats.org/drawingml/2006/wordprocessingDrawing" xmlns:w10="urn:schemas-microsoft-com:office:word" xmlns:w="http://schemas.openxmlformats.org/wordprocessingml/2006/main" xmlns:w14="http://schemas.microsoft.com/office/word/2010/wordml" xmlns:w15="http://schemas.microsoft.com/office/word/2012/wordml" xmlns:w16cei="http://schemas.microsoft.com/office/word/2026/wordml/cei" xmlns:w16cex="http://schemas.microsoft.com/office/word/2018/wordml/cex" xmlns:w16cid="http://schemas.microsoft.com/office/word/2016/wordml/cid" xmlns:w16="http://schemas.microsoft.com/office/word/2018/wordml" xmlns:w16du="http://schemas.microsoft.com/office/word/2023/wordml/word16du" xmlns:w16sdtdh="http://schemas.microsoft.com/office/word/2020/wordml/sdtdatahash" xmlns:w16sdtfl="http://schemas.microsoft.com/office/word/2024/wordml/sdtformatlock" xmlns:w16se="http://schemas.microsoft.com/office/word/2015/wordml/symex" xmlns:wpg="http://schemas.microsoft.com/office/word/2010/wordprocessingGroup" xmlns:wpi="http://schemas.microsoft.com/office/word/2010/wordprocessingInk" xmlns:wne="http://schemas.microsoft.com/office/word/2006/wordml" xmlns:wps="http://schemas.microsoft.com/office/word/2010/wordprocessingShape" mc:Ignorable="w14 w15 w16se w16cid w16 w16cex w16sdtdh w16sdtfl w16du wp14">
+<w:numbering xmlns:wpc="http://schemas.microsoft.com/office/word/2010/wordprocessingCanvas" xmlns:cx="http://schemas.microsoft.com/office/drawing/2014/chartex" xmlns:cx1="http://schemas.microsoft.com/office/drawing/2015/9/8/chartex" xmlns:cx2="http://schemas.microsoft.com/office/drawing/2015/10/21/chartex" xmlns:cx3="http://schemas.microsoft.com/office/drawing/2016/5/9/chartex" xmlns:cx4="http://schemas.microsoft.com/office/drawing/2016/5/10/chartex" xmlns:cx5="http://schemas.microsoft.com/office/drawing/2016/5/11/chartex" xmlns:cx6="http://schemas.microsoft.com/office/drawing/2016/5/12/chartex" xmlns:cx7="http://schemas.microsoft.com/office/drawing/2016/5/13/chartex" xmlns:cx8="http://schemas.microsoft.com/office/drawing/2016/5/14/chartex" xmlns:mc="http://schemas.openxmlformats.org/markup-compatibility/2006" xmlns:aink="http://schemas.microsoft.com/office/drawing/2016/ink" xmlns:am3d="http://schemas.microsoft.com/office/drawing/2017/model3d" xmlns:o="urn:schemas-microsoft-com:office:office" xmlns:oel="http://schemas.microsoft.com/office/2019/extlst" xmlns:r="http://schemas.openxmlformats.org/officeDocument/2006/relationships" xmlns:m="http://schemas.openxmlformats.org/officeDocument/2006/math" xmlns:v="urn:schemas-microsoft-com:vml" xmlns:wp14="http://schemas.microsoft.com/office/word/2010/wordprocessingDrawing" xmlns:wp="http://schemas.openxmlformats.org/drawingml/2006/wordprocessingDrawing" xmlns:w10="urn:schemas-microsoft-com:office:word" xmlns:w="http://schemas.openxmlformats.org/wordprocessingml/2006/main" xmlns:w14="http://schemas.microsoft.com/office/word/2010/wordml" xmlns:w15="http://schemas.microsoft.com/office/word/2012/wordml" xmlns:w16cex="http://schemas.microsoft.com/office/word/2018/wordml/cex" xmlns:w16cid="http://schemas.microsoft.com/office/word/2016/wordml/cid" xmlns:w16="http://schemas.microsoft.com/office/word/2018/wordml" xmlns:w16du="http://schemas.microsoft.com/office/word/2023/wordml/word16du" xmlns:w16sdtdh="http://schemas.microsoft.com/office/word/2020/wordml/sdtdatahash" xmlns:w16sdtfl="http://schemas.microsoft.com/office/word/2024/wordml/sdtformatlock" xmlns:w16se="http://schemas.microsoft.com/office/word/2015/wordml/symex" xmlns:wpg="http://schemas.microsoft.com/office/word/2010/wordprocessingGroup" xmlns:wpi="http://schemas.microsoft.com/office/word/2010/wordprocessingInk" xmlns:wne="http://schemas.microsoft.com/office/word/2006/wordml" xmlns:wps="http://schemas.microsoft.com/office/word/2010/wordprocessingShape" mc:Ignorable="w14 w15 w16se w16cid w16 w16cex w16sdtdh w16sdtfl w16du wp14">
   <w:abstractNum w:abstractNumId="0" w15:restartNumberingAfterBreak="0">
     <w:nsid w:val="FFFFFF7C"/>
     <w:multiLevelType w:val="singleLevel"/>

</xml_diff>